<commit_message>
Reframe proposal around compaction-aware intervention
</commit_message>
<xml_diff>
--- a/01_提案/Project_Proposal_Yu_Yeung_Guo.docx
+++ b/01_提案/Project_Proposal_Yu_Yeung_Guo.docx
@@ -8,7 +8,7 @@
         <w:jc w:val="center"/>
       </w:pPr>
       <w:r>
-        <w:t>Do AI Platform Agents Know When to Ask for Help</w:t>
+        <w:t>Do AI Platform Agents Know What They Must Not Forget</w:t>
       </w:r>
     </w:p>
     <w:p>
@@ -20,7 +20,7 @@
         </w:rPr>
       </w:pPr>
       <w:r>
-        <w:t>Context Aware Intervention Before State Changing Operations</w:t>
+        <w:t>Compaction Aware Intervention Before State Changing Operations</w:t>
       </w:r>
     </w:p>
     <w:p>
@@ -67,7 +67,7 @@
         </w:rPr>
       </w:pPr>
       <w:r>
-        <w:t>Tool-using agents can automate consequential platform operations, but an incorrect write action may interrupt a service, cross an ownership boundary, or create an unrecoverable state. We will study whether a context-aware intervention gate can decide when an agent should Execute, request Confirmation, or Handoff to a human before a state-changing tool call. Drawing on the stateful evaluation designs of τ-bench and ToolSandbox, mutation-gated verification in SABER, and uncertainty estimation through repeated judgments, we will construct a controlled benchmark of 40 base scenarios with three matched context variants each (120 cases) across GPU quota changes, workload preemption, resource transfer, model rollout, and capacity reclamation. Within each family, the proposed operation remains similar while approval evidence, ownership, production status, reversibility, recovery paths, and blast radius change. A deterministic simulator and state-transition oracle will label harmful mutations independently of the routing decision, and sibling variants will remain in one data split. Strictly inadmissible or malformed actions will be blocked before learned routing. For eligible actions, the gate will combine explicit runtime evidence, including scoped approvals, ownership, reversibility, recovery paths, active incidents, and blast radius, with repeated critic judgments summarized by mean risk and disagreement. Two small calibrated classifiers will estimate the probability that execution is harmful and, when risk is present, the probability that one confirmation round can resolve it. Thresholds selected only on the development set will map these estimates to Execute, Confirm, or Handoff. We will compare ungated execution, verify-every-mutation, static tool tiers, verbalized confidence, a single prompted critic, and majority voting. Evaluation will report harmful-mutation rate, safe autonomous completion, coverage, selective risk, Brier score, risk-coverage curves, intervention burden, latency, token cost, ablations, and failure analysis. Qingcheng Yu will focus on scenario design, intervention policy, and evaluation, based on prior work in agent products, lifecycle controls, and human-in-the-loop evaluation. Siu Kwun Yeung will focus on enterprise workflow and audit design, drawing on her HSBC internship experience with multi-agent search, verification, analysis, and human review. Qingyin Guo will focus on runtime and tool integration, drawing on his startup experience building a travel agent for multi-source parsing, search, itinerary planning, and map APIs. The study will test whether calibrated hybrid intervention improves the safety-autonomy trade-off without treating controlled synthetic results as production guarantees.</w:t>
+        <w:t>Long-running tool-using agents must compress histories to control context windows, latency, and cost, yet a summary that drops an approval scope, prohibition, expiry, or rollback condition can change whether a later write action is safe. We will study whether a compaction-aware intervention gate can preserve the right context and decide Execute, request Confirmation, or Handoff before an AI platform agent changes external state. Drawing on τ-bench and ToolSandbox for stateful evaluation, SABER for mutation-gated verification, and ACON and Governance Decay for context compression, we will build a controlled benchmark of 40 base scenarios with three matched variants each (120 cases) across GPU quota changes, workload preemption, resource transfer, model rollout, and capacity reclamation. Each scenario will contain distractor logs plus decision-critical evidence about approval scope, ownership, production status, reversibility, recovery paths, expiry, or blast radius. A deterministic simulator and state-transition oracle will judge harmful mutations independently of the router, while sibling variants remain in one split. We will compare full context, tail truncation, generic summarization, fixed constraint pinning, and a selective human-in-the-loop strategy. Our method will automatically remove recoverable tool noise, pin clearly safety-critical constraints, and ask a short human question only when the importance, validity, or authority of a candidate memory is ambiguous. The compacted context will then feed a hybrid gate that first blocks malformed or strictly forbidden actions, then combines runtime evidence and repeated critic judgments to choose Execute, Confirm, or Handoff. Thresholds will be selected on development data and frozen for test. Evaluation will report harmful-mutation rate, safe autonomous completion, critical-fact retention, context reduction, routing accuracy, human-review burden, latency, and token cost, with ablations and failure analysis. Qingcheng Yu will lead scenario and intervention design using experience in agent products, lifecycle controls, and human-in-the-loop evaluation; Siu Kwun Yeung will lead enterprise workflow and audit design based on work with multi-agent search, verification, analysis, and human review; Qingyin Guo will lead runtime and tool integration based on building a travel agent with multi-source parsing, planning, search, and map APIs. A local five-scenario feasibility pilot motivated this design, but the project will treat synthetic results as controlled evidence rather than production guarantees.</w:t>
       </w:r>
     </w:p>
     <w:sectPr>

</xml_diff>

<commit_message>
docs: align proposal and milestone with compaction audit
</commit_message>
<xml_diff>
--- a/01_提案/Project_Proposal_Yu_Yeung_Guo.docx
+++ b/01_提案/Project_Proposal_Yu_Yeung_Guo.docx
@@ -8,7 +8,7 @@
         <w:jc w:val="center"/>
       </w:pPr>
       <w:r>
-        <w:t>Do AI Platform Agents Know What They Must Not Forget</w:t>
+        <w:t>Do AI Platform Agents Know What They Must Not Forget?</w:t>
       </w:r>
     </w:p>
     <w:p>
@@ -20,7 +20,7 @@
         </w:rPr>
       </w:pPr>
       <w:r>
-        <w:t>Compaction Aware Intervention Before State Changing Operations</w:t>
+        <w:t>Compaction-Aware Intervention Before State-Changing Operations</w:t>
       </w:r>
     </w:p>
     <w:p>
@@ -67,7 +67,7 @@
         </w:rPr>
       </w:pPr>
       <w:r>
-        <w:t>Long-running tool-using agents must compress histories to control context windows, latency, and cost, yet a summary that drops an approval scope, prohibition, expiry, or rollback condition can change whether a later write action is safe. We will study whether a compaction-aware intervention gate can preserve the right context and decide Execute, request Confirmation, or Handoff before an AI platform agent changes external state. Drawing on τ-bench and ToolSandbox for stateful evaluation, SABER for mutation-gated verification, and ACON and Governance Decay for context compression, we will build a controlled benchmark of 40 base scenarios with three matched variants each (120 cases) across GPU quota changes, workload preemption, resource transfer, model rollout, and capacity reclamation. Each scenario will contain distractor logs plus decision-critical evidence about approval scope, ownership, production status, reversibility, recovery paths, expiry, or blast radius. A deterministic simulator and state-transition oracle will judge harmful mutations independently of the router, while sibling variants remain in one split. We will compare full context, tail truncation, generic summarization, fixed constraint pinning, and a selective human-in-the-loop strategy. Our method will automatically remove recoverable tool noise, pin clearly safety-critical constraints, and ask a short human question only when the importance, validity, or authority of a candidate memory is ambiguous. The compacted context will then feed a hybrid gate that first blocks malformed or strictly forbidden actions, then combines runtime evidence and repeated critic judgments to choose Execute, Confirm, or Handoff. Thresholds will be selected on development data and frozen for test. Evaluation will report harmful-mutation rate, safe autonomous completion, critical-fact retention, context reduction, routing accuracy, human-review burden, latency, and token cost, with ablations and failure analysis. Qingcheng Yu will lead scenario and intervention design using experience in agent products, lifecycle controls, and human-in-the-loop evaluation; Siu Kwun Yeung will lead enterprise workflow and audit design based on work with multi-agent search, verification, analysis, and human review; Qingyin Guo will lead runtime and tool integration based on building a travel agent with multi-source parsing, planning, search, and map APIs. A local five-scenario feasibility pilot motivated this design, but the project will treat synthetic results as controlled evidence rather than production guarantees.</w:t>
+        <w:t>Long-running tool-using agents often shorten histories to control context length, latency, and cost, but compaction can omit an approval boundary, prohibition, expiry, entity, amount, or recovery condition that determines whether a later tool call is safe. We will test whether a post-compaction evidence audit, applied immediately before a state-changing operation, can use missing or conflicting evidence to choose Execute, Confirm, or Handoff under a fixed context budget. The project builds on stateful agent evaluation in τ-bench and ToolSandbox, mutation-gated verification in SABER, evidence-preserving context management in U-Fold, and the constraint-loss problem demonstrated by Governance Decay. Our intended contribution is not another general-purpose compressor; it is a selective intervention layer that links compaction failures to action-time control. We will construct 20 base scenarios in a deterministic AI-platform simulator, covering quota changes, workload preemption, resource transfer, model rollout, and capacity reclamation. Each base scenario will produce three matched variants—complete evidence, one action-critical item removed, and matched non-critical noise removed—for 60 cases, with sibling variants kept in the same split. Evidence will cover the target entity, requested scale, authorization scope, validity or expiry, negative constraints, and reversibility or recovery. We will compare full history, a recent-window baseline, generic summarization, fixed constraint pinning, a U-Fold-inspired intent-summary-plus-tool-log baseline, and our audit-guided policy. The audit will check whether required evidence is present and mutually consistent; sufficient evidence permits Execute, an answerable omission triggers Confirm, and a policy conflict or unresolved high-impact action triggers Handoff. A state-transition oracle will score consequences independently of the router. Thresholds will be selected on development cases and frozen before testing. We will report harmful-mutation rate, safe autonomous completion, critical-evidence retention, intervention accuracy, human-review burden, context reduction, latency, and token cost, together with ablations and error analysis. Qingcheng Yu will lead scenario and intervention specifications, drawing on agent lifecycle and human-in-the-loop evaluation experience. Siu Kwun Yeung will lead evidence and audit design, drawing on enterprise multi-agent verification and human review. Qingyin Guo will lead simulator and tool integration, drawing on multi-source agent planning and API orchestration. A small local pilot will validate feasibility only; we will not present synthetic results as production guarantees.</w:t>
       </w:r>
     </w:p>
     <w:sectPr>

</xml_diff>

<commit_message>
docs: refine proposal team fit and presentation plan
</commit_message>
<xml_diff>
--- a/01_提案/Project_Proposal_Yu_Yeung_Guo.docx
+++ b/01_提案/Project_Proposal_Yu_Yeung_Guo.docx
@@ -5,27 +5,33 @@
     <w:p>
       <w:pPr>
         <w:pStyle w:val="aa"/>
+        <w:keepNext/>
+        <w:spacing w:after="100"/>
         <w:jc w:val="center"/>
       </w:pPr>
       <w:r>
-        <w:t>Do AI Platform Agents Know What They Must Not Forget?</w:t>
+        <w:t>Do AI Platform Agents Know What They Must Not Forget</w:t>
       </w:r>
     </w:p>
     <w:p>
       <w:pPr>
         <w:pStyle w:val="ProposalSubtitle"/>
+        <w:keepNext/>
+        <w:spacing w:after="160"/>
         <w:jc w:val="center"/>
         <w:rPr>
           <w:rFonts w:hint="eastAsia"/>
         </w:rPr>
       </w:pPr>
       <w:r>
-        <w:t>Compaction-Aware Intervention Before State-Changing Operations</w:t>
+        <w:t>Compaction Aware Intervention Before State Changing Operations</w:t>
       </w:r>
     </w:p>
     <w:p>
       <w:pPr>
         <w:pStyle w:val="ProposalMetadata"/>
+        <w:keepNext/>
+        <w:spacing w:after="60"/>
         <w:jc w:val="center"/>
         <w:rPr>
           <w:rFonts w:hint="eastAsia"/>
@@ -38,6 +44,8 @@
     <w:p>
       <w:pPr>
         <w:pStyle w:val="ProposalMetadata"/>
+        <w:keepNext/>
+        <w:spacing w:after="240"/>
         <w:jc w:val="center"/>
         <w:rPr>
           <w:rFonts w:hint="eastAsia"/>
@@ -45,35 +53,56 @@
       </w:pPr>
       <w:r>
         <w:t>Qingcheng Yu · Siu Kwun Yeung · Qingyin Guo</w:t>
-      </w:r>
-      <w:r>
         <w:br/>
         <w:t>Fall 2026</w:t>
       </w:r>
     </w:p>
     <w:p>
       <w:pPr>
-        <w:rPr>
-          <w:rFonts w:hint="eastAsia"/>
-        </w:rPr>
-      </w:pPr>
-    </w:p>
-    <w:p>
-      <w:pPr>
-        <w:ind w:firstLine="403"/>
+        <w:keepLines/>
+        <w:widowControl/>
+        <w:spacing w:line="288" w:lineRule="auto" w:before="0" w:after="0"/>
+        <w:ind w:firstLine="360"/>
         <w:jc w:val="both"/>
         <w:rPr>
           <w:lang w:eastAsia="zh-CN"/>
         </w:rPr>
       </w:pPr>
       <w:r>
-        <w:t>Long-running tool-using agents often shorten histories to control context length, latency, and cost, but compaction can omit an approval boundary, prohibition, expiry, entity, amount, or recovery condition that determines whether a later tool call is safe. We will test whether a post-compaction evidence audit, applied immediately before a state-changing operation, can use missing or conflicting evidence to choose Execute, Confirm, or Handoff under a fixed context budget. The project builds on stateful agent evaluation in τ-bench and ToolSandbox, mutation-gated verification in SABER, evidence-preserving context management in U-Fold, and the constraint-loss problem demonstrated by Governance Decay. Our intended contribution is not another general-purpose compressor; it is a selective intervention layer that links compaction failures to action-time control. We will construct 20 base scenarios in a deterministic AI-platform simulator, covering quota changes, workload preemption, resource transfer, model rollout, and capacity reclamation. Each base scenario will produce three matched variants—complete evidence, one action-critical item removed, and matched non-critical noise removed—for 60 cases, with sibling variants kept in the same split. Evidence will cover the target entity, requested scale, authorization scope, validity or expiry, negative constraints, and reversibility or recovery. We will compare full history, a recent-window baseline, generic summarization, fixed constraint pinning, a U-Fold-inspired intent-summary-plus-tool-log baseline, and our audit-guided policy. The audit will check whether required evidence is present and mutually consistent; sufficient evidence permits Execute, an answerable omission triggers Confirm, and a policy conflict or unresolved high-impact action triggers Handoff. A state-transition oracle will score consequences independently of the router. Thresholds will be selected on development cases and frozen before testing. We will report harmful-mutation rate, safe autonomous completion, critical-evidence retention, intervention accuracy, human-review burden, context reduction, latency, and token cost, together with ablations and error analysis. Qingcheng Yu will lead scenario and intervention specifications, drawing on agent lifecycle and human-in-the-loop evaluation experience. Siu Kwun Yeung will lead evidence and audit design, drawing on enterprise multi-agent verification and human review. Qingyin Guo will lead simulator and tool integration, drawing on multi-source agent planning and API orchestration. A small local pilot will validate feasibility only; we will not present synthetic results as production guarantees.</w:t>
+        <w:t xml:space="preserve">Long-running tool-using agents compact earlier interactions to control context length, latency, and cost. This can remove an approval boundary, prohibition, expiry, entity, amount, or recovery condition that determines whether the next tool call is safe. We ask whether a post-compaction evidence audit, applied immediately before a state-changing operation and under a fixed context budget, can choose Execute, Confirm, or Handoff more reliably than standard compaction methods. Our reading will connect stateful agent evaluation in τ-bench and ToolSandbox, pre-action review in SABER, evidence-preserving context management in U-Fold, and Governance Decay, which studies how compaction can erase visible policy constraints and lead to prohibited actions. We will build 20 base scenarios in a deterministic AI-platform simulator covering quota changes, workload preemption, resource transfer, model rollout, financial-style approvals, and delegated multi-agent actions. Each base produces three matched cases: complete evidence, one action-critical item removed, and equal-length non-critical noise removed, for 60 cases kept together by base during splitting. We will compare full history, a recent window, neutral and task-aware summaries, fixed constraint pinning, a U-Fold-inspired baseline, and our evidence-audit policy under the same raw-token budget. The audit permits Execute only when authority, scope, validity, negative constraints, and recovery evidence support the proposed operation; a single answerable gap triggers Confirm, while operator-only authority or unresolved policy conflict triggers Handoff. A deterministic state-transition oracle will score actual consequences. Quantitative evaluation will report harmful mutation, safe autonomous completion, critical-evidence retention, grounding precision, intervention accuracy, human-review burden, context reduction, latency, and token cost, with matched counterfactual tests and ablations. Qualitatively, the final report and demonstration will show a long trajectory, the evidence retained or lost during compaction, the resulting route, and the simulator state difference. Our team combines </w:t>
+      </w:r>
+      <w:r>
+        <w:rPr>
+          <w:b/>
+        </w:rPr>
+        <w:t>Qingcheng Yu</w:t>
+      </w:r>
+      <w:r>
+        <w:t xml:space="preserve">’s experience in agent lifecycle and human-in-the-loop evaluation, </w:t>
+      </w:r>
+      <w:r>
+        <w:rPr>
+          <w:b/>
+        </w:rPr>
+        <w:t>Siu Kwun Yeung</w:t>
+      </w:r>
+      <w:r>
+        <w:t xml:space="preserve">’s experience in enterprise multi-agent verification and audit, and </w:t>
+      </w:r>
+      <w:r>
+        <w:rPr>
+          <w:b/>
+        </w:rPr>
+        <w:t>Qingyin Guo</w:t>
+      </w:r>
+      <w:r>
+        <w:t>’s experience in tool/API integration and agent orchestration. These backgrounds map directly to scenario design, evidence auditing, and simulator implementation. A small local pilot will validate feasibility, and synthetic results will not be presented as production guarantees.</w:t>
       </w:r>
     </w:p>
     <w:sectPr>
       <w:footerReference w:type="default" r:id="rId8"/>
       <w:pgSz w:w="12240" w:h="15840"/>
-      <w:pgMar w:top="1224" w:right="1368" w:bottom="1152" w:left="1368" w:header="720" w:footer="720" w:gutter="0"/>
+      <w:pgMar w:top="1152" w:right="1368" w:bottom="1080" w:left="1368" w:header="432" w:footer="432" w:gutter="0"/>
       <w:cols w:space="720"/>
       <w:docGrid w:linePitch="360"/>
     </w:sectPr>
@@ -122,13 +151,6 @@
         <w:rFonts w:hint="eastAsia"/>
       </w:rPr>
     </w:pPr>
-    <w:r>
-      <w:rPr>
-        <w:color w:val="5F5F5F"/>
-        <w:sz w:val="18"/>
-      </w:rPr>
-      <w:t>Project proposal   Due 5 October 2026 at 11:59 pm</w:t>
-    </w:r>
   </w:p>
 </w:ftr>
 </file>
@@ -758,12 +780,12 @@
     <w:qFormat/>
     <w:rsid w:val="00FC693F"/>
     <w:pPr>
-      <w:spacing w:after="0" w:line="283" w:lineRule="auto"/>
+      <w:spacing w:after="0" w:line="288" w:lineRule="auto"/>
     </w:pPr>
     <w:rPr>
-      <w:rFonts w:ascii="Aptos" w:hAnsi="Aptos"/>
+      <w:rFonts w:ascii="Arial" w:hAnsi="Arial" w:eastAsia="Arial"/>
       <w:color w:val="000000"/>
-      <w:sz w:val="23"/>
+      <w:sz w:val="21"/>
     </w:rPr>
   </w:style>
   <w:style w:type="paragraph" w:styleId="1">
@@ -1111,8 +1133,9 @@
       <w:contextualSpacing/>
     </w:pPr>
     <w:rPr>
-      <w:rFonts w:asciiTheme="majorHAnsi" w:eastAsiaTheme="majorEastAsia" w:hAnsiTheme="majorHAnsi" w:cstheme="majorBidi"/>
+      <w:rFonts w:asciiTheme="majorHAnsi" w:eastAsiaTheme="majorEastAsia" w:hAnsiTheme="majorHAnsi" w:cstheme="majorBidi" w:ascii="Arial" w:hAnsi="Arial" w:eastAsia="Arial"/>
       <w:b/>
+      <w:color w:val="000000"/>
       <w:spacing w:val="5"/>
       <w:kern w:val="28"/>
       <w:sz w:val="38"/>
@@ -11758,10 +11781,10 @@
       <w:spacing w:after="260"/>
     </w:pPr>
     <w:rPr>
-      <w:rFonts w:ascii="Aptos" w:hAnsi="Aptos"/>
+      <w:rFonts w:ascii="Arial" w:hAnsi="Arial" w:eastAsia="Arial"/>
       <w:b/>
       <w:color w:val="000000"/>
-      <w:sz w:val="25"/>
+      <w:sz w:val="23"/>
     </w:rPr>
   </w:style>
   <w:style w:type="paragraph" w:customStyle="1" w:styleId="ProposalMetadata">
@@ -11770,9 +11793,9 @@
       <w:spacing w:after="60"/>
     </w:pPr>
     <w:rPr>
-      <w:rFonts w:ascii="Aptos" w:hAnsi="Aptos"/>
-      <w:color w:val="464646"/>
-      <w:sz w:val="21"/>
+      <w:rFonts w:ascii="Arial" w:hAnsi="Arial" w:eastAsia="Arial"/>
+      <w:color w:val="4A4A4A"/>
+      <w:sz w:val="19"/>
     </w:rPr>
   </w:style>
 </w:styles>

</xml_diff>